<commit_message>
Update Kepszerkeszto_Dokumentacio.docx with additional context and links
</commit_message>
<xml_diff>
--- a/Kepszerkeszto_Dokumentacio.docx
+++ b/Kepszerkeszto_Dokumentacio.docx
@@ -1,6 +1,6 @@
 
 <file path=word/document.xml><?xml version="1.0" encoding="utf-8"?>
-<w:document xmlns:wpc="http://schemas.microsoft.com/office/word/2010/wordprocessingCanvas" xmlns:cx="http://schemas.microsoft.com/office/drawing/2014/chartex" xmlns:cx1="http://schemas.microsoft.com/office/drawing/2015/9/8/chartex" xmlns:cx2="http://schemas.microsoft.com/office/drawing/2015/10/21/chartex" xmlns:cx3="http://schemas.microsoft.com/office/drawing/2016/5/9/chartex" xmlns:cx4="http://schemas.microsoft.com/office/drawing/2016/5/10/chartex" xmlns:cx5="http://schemas.microsoft.com/office/drawing/2016/5/11/chartex" xmlns:cx6="http://schemas.microsoft.com/office/drawing/2016/5/12/chartex" xmlns:cx7="http://schemas.microsoft.com/office/drawing/2016/5/13/chartex" xmlns:cx8="http://schemas.microsoft.com/office/drawing/2016/5/14/chartex" xmlns:mc="http://schemas.openxmlformats.org/markup-compatibility/2006" xmlns:aink="http://schemas.microsoft.com/office/drawing/2016/ink" xmlns:am3d="http://schemas.microsoft.com/office/drawing/2017/model3d" xmlns:o="urn:schemas-microsoft-com:office:office" xmlns:oel="http://schemas.microsoft.com/office/2019/extlst" xmlns:r="http://schemas.openxmlformats.org/officeDocument/2006/relationships" xmlns:m="http://schemas.openxmlformats.org/officeDocument/2006/math" xmlns:v="urn:schemas-microsoft-com:vml" xmlns:wp14="http://schemas.microsoft.com/office/word/2010/wordprocessingDrawing" xmlns:wp="http://schemas.openxmlformats.org/drawingml/2006/wordprocessingDrawing" xmlns:w10="urn:schemas-microsoft-com:office:word" xmlns:w="http://schemas.openxmlformats.org/wordprocessingml/2006/main" xmlns:w14="http://schemas.microsoft.com/office/word/2010/wordml" xmlns:w15="http://schemas.microsoft.com/office/word/2012/wordml" xmlns:w16cex="http://schemas.microsoft.com/office/word/2018/wordml/cex" xmlns:w16cid="http://schemas.microsoft.com/office/word/2016/wordml/cid" xmlns:w16="http://schemas.microsoft.com/office/word/2018/wordml" xmlns:w16du="http://schemas.microsoft.com/office/word/2023/wordml/word16du" xmlns:w16sdtdh="http://schemas.microsoft.com/office/word/2020/wordml/sdtdatahash" xmlns:w16sdtfl="http://schemas.microsoft.com/office/word/2024/wordml/sdtformatlock" xmlns:w16se="http://schemas.microsoft.com/office/word/2015/wordml/symex" xmlns:wpg="http://schemas.microsoft.com/office/word/2010/wordprocessingGroup" xmlns:wpi="http://schemas.microsoft.com/office/word/2010/wordprocessingInk" xmlns:wne="http://schemas.microsoft.com/office/word/2006/wordml" xmlns:wps="http://schemas.microsoft.com/office/word/2010/wordprocessingShape" mc:Ignorable="w14 w15 w16se w16cid w16 w16cex w16sdtdh w16sdtfl w16du wp14">
+<w:document xmlns:wpc="http://schemas.microsoft.com/office/word/2010/wordprocessingCanvas" xmlns:cx="http://schemas.microsoft.com/office/drawing/2014/chartex" xmlns:cx1="http://schemas.microsoft.com/office/drawing/2015/9/8/chartex" xmlns:cx2="http://schemas.microsoft.com/office/drawing/2015/10/21/chartex" xmlns:cx3="http://schemas.microsoft.com/office/drawing/2016/5/9/chartex" xmlns:cx4="http://schemas.microsoft.com/office/drawing/2016/5/10/chartex" xmlns:cx5="http://schemas.microsoft.com/office/drawing/2016/5/11/chartex" xmlns:cx6="http://schemas.microsoft.com/office/drawing/2016/5/12/chartex" xmlns:cx7="http://schemas.microsoft.com/office/drawing/2016/5/13/chartex" xmlns:cx8="http://schemas.microsoft.com/office/drawing/2016/5/14/chartex" xmlns:mc="http://schemas.openxmlformats.org/markup-compatibility/2006" xmlns:aink="http://schemas.microsoft.com/office/drawing/2016/ink" xmlns:am3d="http://schemas.microsoft.com/office/drawing/2017/model3d" xmlns:o="urn:schemas-microsoft-com:office:office" xmlns:oel="http://schemas.microsoft.com/office/2019/extlst" xmlns:r="http://schemas.openxmlformats.org/officeDocument/2006/relationships" xmlns:m="http://schemas.openxmlformats.org/officeDocument/2006/math" xmlns:v="urn:schemas-microsoft-com:vml" xmlns:wp14="http://schemas.microsoft.com/office/word/2010/wordprocessingDrawing" xmlns:wp="http://schemas.openxmlformats.org/drawingml/2006/wordprocessingDrawing" xmlns:w10="urn:schemas-microsoft-com:office:word" xmlns:w="http://schemas.openxmlformats.org/wordprocessingml/2006/main" xmlns:w14="http://schemas.microsoft.com/office/word/2010/wordml" xmlns:w15="http://schemas.microsoft.com/office/word/2012/wordml" xmlns:w16cex="http://schemas.microsoft.com/office/word/2018/wordml/cex" xmlns:w16cid="http://schemas.microsoft.com/office/word/2016/wordml/cid" xmlns:w16="http://schemas.microsoft.com/office/word/2018/wordml" xmlns:w16du="http://schemas.microsoft.com/office/word/2023/wordml/word16du" xmlns:w16sdtdh="http://schemas.microsoft.com/office/word/2020/wordml/sdtdatahash" xmlns:w16sdtfl="http://schemas.microsoft.com/office/word/2024/wordml/sdtformatlock" xmlns:w16se="http://schemas.microsoft.com/office/word/2015/wordml/symex" xmlns:wpg="http://schemas.microsoft.com/office/word/2010/wordprocessingGroup" xmlns:wpi="http://schemas.microsoft.com/office/word/2010/wordprocessingInk" xmlns:wne="http://schemas.microsoft.com/office/word/2006/wordml" xmlns:wps="http://schemas.microsoft.com/office/word/2010/wordprocessingShape" xmlns:a="http://schemas.openxmlformats.org/drawingml/2006/main" xmlns:pic="http://schemas.openxmlformats.org/drawingml/2006/picture" xmlns:a14="http://schemas.microsoft.com/office/drawing/2010/main" mc:Ignorable="w14 w15 w16se w16cid w16 w16cex w16sdtdh w16sdtfl w16du wp14">
   <w:body>
     <w:p>
       <w:pPr>
@@ -60,7 +60,7 @@
     </w:p>
     <w:p>
       <w:pPr>
-        <w:spacing w:after="0"/>
+        <w:spacing w:after="0" w:afterAutospacing="off"/>
         <w:rPr>
           <w:sz w:val="36"/>
           <w:szCs w:val="36"/>
@@ -71,102 +71,24 @@
           <w:sz w:val="36"/>
           <w:szCs w:val="36"/>
         </w:rPr>
-        <w:t>Funkciói:</w:t>
-      </w:r>
-    </w:p>
-    <w:p>
-      <w:pPr>
-        <w:spacing w:after="0"/>
-        <w:rPr>
-          <w:sz w:val="28"/>
-          <w:szCs w:val="28"/>
-        </w:rPr>
-      </w:pPr>
-      <w:r>
-        <w:rPr>
-          <w:sz w:val="28"/>
-          <w:szCs w:val="28"/>
-        </w:rPr>
-        <w:t>- Szöveg felismerése</w:t>
-      </w:r>
-    </w:p>
-    <w:p>
-      <w:pPr>
-        <w:spacing w:after="0"/>
-        <w:rPr>
-          <w:sz w:val="28"/>
-          <w:szCs w:val="28"/>
-        </w:rPr>
-      </w:pPr>
-      <w:r>
-        <w:rPr>
-          <w:sz w:val="28"/>
-          <w:szCs w:val="28"/>
-        </w:rPr>
-        <w:t>- Felismert szöveg körbevágása</w:t>
-      </w:r>
-    </w:p>
-    <w:p>
-      <w:pPr>
-        <w:spacing w:after="0"/>
-        <w:rPr>
-          <w:sz w:val="28"/>
-          <w:szCs w:val="28"/>
-        </w:rPr>
-      </w:pPr>
-      <w:r>
-        <w:rPr>
-          <w:sz w:val="28"/>
-          <w:szCs w:val="28"/>
-        </w:rPr>
-        <w:t>- Szöveg képre illesztése</w:t>
-      </w:r>
-    </w:p>
-    <w:p>
-      <w:pPr>
-        <w:spacing w:after="0"/>
-        <w:rPr>
-          <w:sz w:val="28"/>
-          <w:szCs w:val="28"/>
-        </w:rPr>
-      </w:pPr>
-      <w:r>
-        <w:rPr>
-          <w:sz w:val="28"/>
-          <w:szCs w:val="28"/>
-        </w:rPr>
-        <w:t>- Háttér módosítása</w:t>
-      </w:r>
-    </w:p>
-    <w:p>
-      <w:pPr>
-        <w:spacing w:after="0"/>
-        <w:rPr>
-          <w:sz w:val="28"/>
-          <w:szCs w:val="28"/>
-        </w:rPr>
-      </w:pPr>
-      <w:r>
-        <w:rPr>
-          <w:sz w:val="28"/>
-          <w:szCs w:val="28"/>
-        </w:rPr>
-        <w:t>- Fényerő módosítása</w:t>
-      </w:r>
-    </w:p>
-    <w:p>
-      <w:pPr>
-        <w:rPr>
-          <w:sz w:val="28"/>
-          <w:szCs w:val="28"/>
-        </w:rPr>
-      </w:pPr>
-      <w:r>
-        <w:rPr>
-          <w:sz w:val="28"/>
-          <w:szCs w:val="28"/>
-        </w:rPr>
-        <w:t>- Kért tárgy felismerése, körbevágása</w:t>
+        <w:t>Környezet:</w:t>
+      </w:r>
+    </w:p>
+    <w:p>
+      <w:pPr>
+        <w:pStyle w:val="Norml"/>
+        <w:ind w:left="0"/>
+        <w:rPr>
+          <w:sz w:val="28"/>
+          <w:szCs w:val="28"/>
+        </w:rPr>
+      </w:pPr>
+      <w:r>
+        <w:rPr>
+          <w:sz w:val="28"/>
+          <w:szCs w:val="28"/>
+        </w:rPr>
+        <w:t>-Visual Studio Code</w:t>
       </w:r>
     </w:p>
     <w:p>
@@ -182,202 +104,382 @@
           <w:sz w:val="36"/>
           <w:szCs w:val="36"/>
         </w:rPr>
-        <w:t xml:space="preserve">Használt </w:t>
-      </w:r>
-      <w:proofErr w:type="spellStart"/>
-      <w:r>
+        <w:t>Funkciói:</w:t>
+      </w:r>
+    </w:p>
+    <w:p>
+      <w:pPr>
+        <w:spacing w:after="0"/>
+        <w:rPr>
+          <w:sz w:val="28"/>
+          <w:szCs w:val="28"/>
+        </w:rPr>
+      </w:pPr>
+      <w:r>
+        <w:rPr>
+          <w:sz w:val="28"/>
+          <w:szCs w:val="28"/>
+        </w:rPr>
+        <w:t>- Szöveg felismerése</w:t>
+      </w:r>
+    </w:p>
+    <w:p>
+      <w:pPr>
+        <w:spacing w:after="0"/>
+        <w:rPr>
+          <w:sz w:val="28"/>
+          <w:szCs w:val="28"/>
+        </w:rPr>
+      </w:pPr>
+      <w:r>
+        <w:rPr>
+          <w:sz w:val="28"/>
+          <w:szCs w:val="28"/>
+        </w:rPr>
+        <w:t>- Felismert szöveg körbevágása</w:t>
+      </w:r>
+    </w:p>
+    <w:p>
+      <w:pPr>
+        <w:spacing w:after="0"/>
+        <w:rPr>
+          <w:sz w:val="28"/>
+          <w:szCs w:val="28"/>
+        </w:rPr>
+      </w:pPr>
+      <w:r>
+        <w:rPr>
+          <w:sz w:val="28"/>
+          <w:szCs w:val="28"/>
+        </w:rPr>
+        <w:t>- Szöveg képre illesztése</w:t>
+      </w:r>
+    </w:p>
+    <w:p>
+      <w:pPr>
+        <w:spacing w:after="0"/>
+        <w:rPr>
+          <w:sz w:val="28"/>
+          <w:szCs w:val="28"/>
+        </w:rPr>
+      </w:pPr>
+      <w:r>
+        <w:rPr>
+          <w:sz w:val="28"/>
+          <w:szCs w:val="28"/>
+        </w:rPr>
+        <w:t>- Háttér módosítása</w:t>
+      </w:r>
+    </w:p>
+    <w:p>
+      <w:pPr>
+        <w:spacing w:after="0"/>
+        <w:rPr>
+          <w:sz w:val="28"/>
+          <w:szCs w:val="28"/>
+        </w:rPr>
+      </w:pPr>
+      <w:r>
+        <w:rPr>
+          <w:sz w:val="28"/>
+          <w:szCs w:val="28"/>
+        </w:rPr>
+        <w:t>- Fényerő módosítása</w:t>
+      </w:r>
+    </w:p>
+    <w:p>
+      <w:pPr>
+        <w:rPr>
+          <w:sz w:val="28"/>
+          <w:szCs w:val="28"/>
+        </w:rPr>
+      </w:pPr>
+      <w:r>
+        <w:rPr>
+          <w:sz w:val="28"/>
+          <w:szCs w:val="28"/>
+        </w:rPr>
+        <w:t>- Kért tárgy felismerése, körbevágása</w:t>
+      </w:r>
+    </w:p>
+    <w:p>
+      <w:pPr>
+        <w:spacing w:after="0"/>
         <w:rPr>
           <w:sz w:val="36"/>
           <w:szCs w:val="36"/>
         </w:rPr>
-        <w:t>Model</w:t>
-      </w:r>
-      <w:proofErr w:type="spellEnd"/>
+      </w:pPr>
       <w:r>
         <w:rPr>
           <w:sz w:val="36"/>
           <w:szCs w:val="36"/>
         </w:rPr>
-        <w:t>:</w:t>
-      </w:r>
-    </w:p>
-    <w:p>
-      <w:pPr>
-        <w:rPr>
-          <w:sz w:val="28"/>
-          <w:szCs w:val="28"/>
-        </w:rPr>
-      </w:pPr>
-      <w:r>
-        <w:rPr>
-          <w:sz w:val="28"/>
-          <w:szCs w:val="28"/>
-        </w:rPr>
-        <w:t>-</w:t>
+        <w:t xml:space="preserve">Használt </w:t>
       </w:r>
       <w:proofErr w:type="spellStart"/>
       <w:r>
-        <w:rPr>
-          <w:sz w:val="28"/>
-          <w:szCs w:val="28"/>
-        </w:rPr>
-        <w:t>timbrooks</w:t>
-      </w:r>
-      <w:proofErr w:type="spellEnd"/>
-      <w:r>
-        <w:rPr>
-          <w:sz w:val="28"/>
-          <w:szCs w:val="28"/>
-        </w:rPr>
-        <w:t>/instruct-pix2pix</w:t>
-      </w:r>
-    </w:p>
-    <w:p>
-      <w:pPr>
-        <w:spacing w:after="0"/>
         <w:rPr>
           <w:sz w:val="36"/>
           <w:szCs w:val="36"/>
         </w:rPr>
-      </w:pPr>
+        <w:t>Model</w:t>
+      </w:r>
+      <w:proofErr w:type="spellEnd"/>
       <w:r>
         <w:rPr>
           <w:sz w:val="36"/>
           <w:szCs w:val="36"/>
         </w:rPr>
-        <w:t xml:space="preserve">Egyéb </w:t>
-      </w:r>
-      <w:proofErr w:type="spellStart"/>
-      <w:r>
+        <w:t>:</w:t>
+      </w:r>
+    </w:p>
+    <w:p>
+      <w:pPr>
+        <w:spacing w:after="0" w:afterAutospacing="off"/>
+        <w:rPr>
+          <w:sz w:val="28"/>
+          <w:szCs w:val="28"/>
+        </w:rPr>
+      </w:pPr>
+      <w:r>
+        <w:rPr>
+          <w:sz w:val="28"/>
+          <w:szCs w:val="28"/>
+          <w:lang w:val="en-US"/>
+        </w:rPr>
+        <w:t>-</w:t>
+      </w:r>
+      <w:r>
+        <w:rPr>
+          <w:sz w:val="28"/>
+          <w:szCs w:val="28"/>
+          <w:lang w:val="en-US"/>
+        </w:rPr>
+        <w:t>timbrooks</w:t>
+      </w:r>
+      <w:r>
+        <w:rPr>
+          <w:sz w:val="28"/>
+          <w:szCs w:val="28"/>
+          <w:lang w:val="en-US"/>
+        </w:rPr>
+        <w:t>/instruct-pix2pix</w:t>
+      </w:r>
+      <w:r>
+        <w:rPr>
+          <w:sz w:val="28"/>
+          <w:szCs w:val="28"/>
+          <w:lang w:val="en-US"/>
+        </w:rPr>
+        <w:t xml:space="preserve">: </w:t>
+      </w:r>
+    </w:p>
+    <w:p>
+      <w:pPr>
+        <w:ind w:firstLine="708"/>
+        <w:rPr>
+          <w:sz w:val="28"/>
+          <w:szCs w:val="28"/>
+        </w:rPr>
+      </w:pPr>
+      <w:r>
+        <w:rPr>
+          <w:sz w:val="28"/>
+          <w:szCs w:val="28"/>
+          <w:lang w:val="en-US"/>
+        </w:rPr>
+        <w:t>https://huggingface.co/timbrooks/instruct-pix2pix</w:t>
+      </w:r>
+    </w:p>
+    <w:p>
+      <w:pPr>
+        <w:spacing w:after="0"/>
         <w:rPr>
           <w:sz w:val="36"/>
           <w:szCs w:val="36"/>
         </w:rPr>
-        <w:t>Ai</w:t>
-      </w:r>
-      <w:proofErr w:type="spellEnd"/>
+      </w:pPr>
       <w:r>
         <w:rPr>
           <w:sz w:val="36"/>
           <w:szCs w:val="36"/>
         </w:rPr>
-        <w:t xml:space="preserve"> segítség:</w:t>
-      </w:r>
-    </w:p>
-    <w:p>
-      <w:pPr>
-        <w:rPr>
-          <w:sz w:val="28"/>
-          <w:szCs w:val="28"/>
-        </w:rPr>
-      </w:pPr>
-      <w:r>
-        <w:rPr>
-          <w:sz w:val="28"/>
-          <w:szCs w:val="28"/>
-        </w:rPr>
-        <w:t xml:space="preserve">- A GUI építő elemeinek ismertetése: </w:t>
+        <w:t xml:space="preserve">Egyéb </w:t>
       </w:r>
       <w:proofErr w:type="spellStart"/>
       <w:r>
-        <w:rPr>
-          <w:sz w:val="28"/>
-          <w:szCs w:val="28"/>
-        </w:rPr>
-        <w:t>Chatgpt</w:t>
-      </w:r>
-      <w:proofErr w:type="spellEnd"/>
-    </w:p>
-    <w:p>
-      <w:pPr>
-        <w:rPr>
-          <w:sz w:val="28"/>
-          <w:szCs w:val="28"/>
-        </w:rPr>
-      </w:pPr>
-      <w:r>
-        <w:rPr>
-          <w:sz w:val="28"/>
-          <w:szCs w:val="28"/>
-        </w:rPr>
-        <w:t>- A program ellenőrzése (mert nem elég erős a hardware-</w:t>
-      </w:r>
-      <w:proofErr w:type="spellStart"/>
-      <w:r>
-        <w:rPr>
-          <w:sz w:val="28"/>
-          <w:szCs w:val="28"/>
-        </w:rPr>
-        <w:t>em</w:t>
-      </w:r>
-      <w:proofErr w:type="spellEnd"/>
-      <w:r>
-        <w:rPr>
-          <w:sz w:val="28"/>
-          <w:szCs w:val="28"/>
-        </w:rPr>
-        <w:t xml:space="preserve">):  </w:t>
-      </w:r>
-      <w:proofErr w:type="spellStart"/>
-      <w:r>
-        <w:rPr>
-          <w:sz w:val="28"/>
-          <w:szCs w:val="28"/>
-        </w:rPr>
-        <w:t>Gemini</w:t>
-      </w:r>
-      <w:proofErr w:type="spellEnd"/>
-    </w:p>
-    <w:p>
-      <w:pPr>
-        <w:rPr>
-          <w:sz w:val="28"/>
-          <w:szCs w:val="28"/>
-        </w:rPr>
-      </w:pPr>
-      <w:r>
-        <w:rPr>
-          <w:sz w:val="28"/>
-          <w:szCs w:val="28"/>
-        </w:rPr>
-        <w:t xml:space="preserve">- requirements.txt és install.py: </w:t>
-      </w:r>
-      <w:proofErr w:type="spellStart"/>
-      <w:r>
-        <w:rPr>
-          <w:sz w:val="28"/>
-          <w:szCs w:val="28"/>
-        </w:rPr>
-        <w:t>Gemini</w:t>
-      </w:r>
-      <w:proofErr w:type="spellEnd"/>
-    </w:p>
-    <w:p>
-      <w:pPr>
-        <w:spacing w:after="0"/>
         <w:rPr>
           <w:sz w:val="36"/>
           <w:szCs w:val="36"/>
         </w:rPr>
-      </w:pPr>
-    </w:p>
-    <w:p>
-      <w:pPr>
-        <w:spacing w:after="0"/>
+        <w:t>Ai</w:t>
+      </w:r>
+      <w:proofErr w:type="spellEnd"/>
+      <w:r>
         <w:rPr>
           <w:sz w:val="36"/>
           <w:szCs w:val="36"/>
         </w:rPr>
-      </w:pPr>
-    </w:p>
-    <w:p>
-      <w:pPr>
+        <w:t xml:space="preserve"> segítség:</w:t>
+      </w:r>
+    </w:p>
+    <w:p>
+      <w:pPr>
+        <w:rPr>
+          <w:sz w:val="28"/>
+          <w:szCs w:val="28"/>
+        </w:rPr>
+      </w:pPr>
+      <w:r>
+        <w:rPr>
+          <w:sz w:val="28"/>
+          <w:szCs w:val="28"/>
+        </w:rPr>
+        <w:t xml:space="preserve">- A GUI </w:t>
+      </w:r>
+      <w:r>
+        <w:rPr>
+          <w:sz w:val="28"/>
+          <w:szCs w:val="28"/>
+        </w:rPr>
+        <w:t xml:space="preserve">alap </w:t>
+      </w:r>
+      <w:r>
+        <w:rPr>
+          <w:sz w:val="28"/>
+          <w:szCs w:val="28"/>
+        </w:rPr>
+        <w:t xml:space="preserve">építő elemeinek </w:t>
+      </w:r>
+      <w:r>
+        <w:rPr>
+          <w:sz w:val="28"/>
+          <w:szCs w:val="28"/>
+        </w:rPr>
+        <w:t>meg</w:t>
+      </w:r>
+      <w:r>
+        <w:rPr>
+          <w:sz w:val="28"/>
+          <w:szCs w:val="28"/>
+        </w:rPr>
+        <w:t>ismert</w:t>
+      </w:r>
+      <w:r>
+        <w:rPr>
+          <w:sz w:val="28"/>
+          <w:szCs w:val="28"/>
+        </w:rPr>
+        <w:t>é</w:t>
+      </w:r>
+      <w:r>
+        <w:rPr>
+          <w:sz w:val="28"/>
+          <w:szCs w:val="28"/>
+        </w:rPr>
+        <w:t>se</w:t>
+      </w:r>
+      <w:r>
+        <w:rPr>
+          <w:sz w:val="28"/>
+          <w:szCs w:val="28"/>
+        </w:rPr>
+        <w:t xml:space="preserve">: </w:t>
+      </w:r>
+      <w:r>
+        <w:rPr>
+          <w:sz w:val="28"/>
+          <w:szCs w:val="28"/>
+        </w:rPr>
+        <w:t>Chatgpt</w:t>
+      </w:r>
+      <w:r>
+        <w:rPr>
+          <w:sz w:val="28"/>
+          <w:szCs w:val="28"/>
+        </w:rPr>
+        <w:t>: https://chatgpt.com/</w:t>
+      </w:r>
+    </w:p>
+    <w:p>
+      <w:pPr>
+        <w:rPr>
+          <w:sz w:val="28"/>
+          <w:szCs w:val="28"/>
+        </w:rPr>
+      </w:pPr>
+      <w:r>
+        <w:rPr>
+          <w:sz w:val="28"/>
+          <w:szCs w:val="28"/>
+        </w:rPr>
+        <w:t>- A program ellenőrzése (mert nem elég erős a hardware-</w:t>
+      </w:r>
+      <w:proofErr w:type="spellStart"/>
+      <w:r>
+        <w:rPr>
+          <w:sz w:val="28"/>
+          <w:szCs w:val="28"/>
+        </w:rPr>
+        <w:t>em</w:t>
+      </w:r>
+      <w:proofErr w:type="spellEnd"/>
+      <w:r>
+        <w:rPr>
+          <w:sz w:val="28"/>
+          <w:szCs w:val="28"/>
+        </w:rPr>
+        <w:t xml:space="preserve">):  </w:t>
+      </w:r>
+      <w:proofErr w:type="spellStart"/>
+      <w:r>
+        <w:rPr>
+          <w:sz w:val="28"/>
+          <w:szCs w:val="28"/>
+        </w:rPr>
+        <w:t>Gemini</w:t>
+      </w:r>
+      <w:proofErr w:type="spellEnd"/>
+    </w:p>
+    <w:p>
+      <w:pPr>
+        <w:rPr>
+          <w:sz w:val="28"/>
+          <w:szCs w:val="28"/>
+        </w:rPr>
+      </w:pPr>
+      <w:r>
+        <w:rPr>
+          <w:sz w:val="28"/>
+          <w:szCs w:val="28"/>
+        </w:rPr>
+        <w:t xml:space="preserve">- requirements.txt és install.py: </w:t>
+      </w:r>
+      <w:r>
+        <w:rPr>
+          <w:sz w:val="28"/>
+          <w:szCs w:val="28"/>
+        </w:rPr>
+        <w:t>Gemini</w:t>
+      </w:r>
+    </w:p>
+    <w:p>
+      <w:pPr>
+        <w:pStyle w:val="Norml"/>
         <w:spacing w:after="0"/>
         <w:rPr>
-          <w:sz w:val="36"/>
-          <w:szCs w:val="36"/>
-        </w:rPr>
-      </w:pPr>
+          <w:sz w:val="28"/>
+          <w:szCs w:val="28"/>
+        </w:rPr>
+      </w:pPr>
+      <w:r>
+        <w:rPr>
+          <w:sz w:val="28"/>
+          <w:szCs w:val="28"/>
+        </w:rPr>
+        <w:t>-&gt; https://gemini.google.com/app</w:t>
+      </w:r>
     </w:p>
     <w:p>
       <w:pPr>
@@ -684,7 +786,6 @@
           <w:sz w:val="28"/>
           <w:szCs w:val="28"/>
         </w:rPr>
-        <w:lastRenderedPageBreak/>
         <w:t>- Függvények:</w:t>
       </w:r>
     </w:p>
@@ -838,7 +939,6 @@
           <w:sz w:val="28"/>
           <w:szCs w:val="28"/>
         </w:rPr>
-        <w:lastRenderedPageBreak/>
         <w:drawing>
           <wp:inline distT="0" distB="0" distL="0" distR="0" wp14:anchorId="6739DD20" wp14:editId="71735166">
             <wp:extent cx="5731510" cy="2155190"/>
@@ -947,7 +1047,6 @@
         <w:rPr>
           <w:noProof/>
         </w:rPr>
-        <w:lastRenderedPageBreak/>
         <w:drawing>
           <wp:inline distT="0" distB="0" distL="0" distR="0" wp14:anchorId="625A25E0" wp14:editId="618B564B">
             <wp:extent cx="2543175" cy="4991100"/>
@@ -1074,7 +1173,6 @@
         <w:rPr>
           <w:noProof/>
         </w:rPr>
-        <w:lastRenderedPageBreak/>
         <w:drawing>
           <wp:inline distT="0" distB="0" distL="0" distR="0" wp14:anchorId="606ED067" wp14:editId="2C10E4B8">
             <wp:extent cx="5724525" cy="1866900"/>
@@ -1122,6 +1220,8 @@
       </w:r>
       <w:r>
         <w:tab/>
+      </w:r>
+      <w:r>
         <w:t>- Prompt mező:</w:t>
       </w:r>
     </w:p>
@@ -1230,6 +1330,8 @@
       </w:r>
       <w:r>
         <w:tab/>
+      </w:r>
+      <w:r>
         <w:t>- Funkció oldal felosztása:</w:t>
       </w:r>
     </w:p>
@@ -1293,28 +1395,25 @@
         <w:t>- Funkció gombjai és színjelzései és a vége:</w:t>
       </w:r>
     </w:p>
-    <w:p>
-      <w:r>
-        <w:rPr>
-          <w:noProof/>
-        </w:rPr>
+    <w:p w14:noSpellErr="1">
+      <w:r>
         <w:drawing>
-          <wp:inline distT="0" distB="0" distL="0" distR="0" wp14:anchorId="203EE711" wp14:editId="455D7184">
+          <wp:inline wp14:editId="01B99842" wp14:anchorId="203EE711">
             <wp:extent cx="5724525" cy="2981325"/>
             <wp:effectExtent l="0" t="0" r="0" b="0"/>
             <wp:docPr id="883177277" name="drawing"/>
             <wp:cNvGraphicFramePr>
-              <a:graphicFrameLocks xmlns:a="http://schemas.openxmlformats.org/drawingml/2006/main" noChangeAspect="1"/>
+              <a:graphicFrameLocks noChangeAspect="1"/>
             </wp:cNvGraphicFramePr>
-            <a:graphic xmlns:a="http://schemas.openxmlformats.org/drawingml/2006/main">
-              <a:graphicData uri="http://schemas.openxmlformats.org/drawingml/2006/picture">
+            <a:graphic>
+              <a:graphicData xmlns:a="http://schemas.openxmlformats.org/drawingml/2006/main" uri="http://schemas.openxmlformats.org/drawingml/2006/picture">
                 <pic:pic xmlns:pic="http://schemas.openxmlformats.org/drawingml/2006/picture">
                   <pic:nvPicPr>
                     <pic:cNvPr id="883177277" name="Picture 883177277"/>
                     <pic:cNvPicPr/>
                   </pic:nvPicPr>
                   <pic:blipFill>
-                    <a:blip r:embed="rId17">
+                    <a:blip xmlns:r="http://schemas.openxmlformats.org/officeDocument/2006/relationships" r:embed="rId17">
                       <a:extLst>
                         <a:ext uri="{28A0092B-C50C-407E-A947-70E740481C1C}">
                           <a14:useLocalDpi xmlns:a14="http://schemas.microsoft.com/office/drawing/2010/main"/>
@@ -1341,122 +1440,9 @@
         </w:drawing>
       </w:r>
     </w:p>
-    <w:p>
-      <w:pPr>
-        <w:rPr>
-          <w:sz w:val="36"/>
-          <w:szCs w:val="36"/>
-        </w:rPr>
-      </w:pPr>
-      <w:r>
-        <w:rPr>
-          <w:sz w:val="36"/>
-          <w:szCs w:val="36"/>
-        </w:rPr>
-        <w:t>Használata:</w:t>
-      </w:r>
-    </w:p>
-    <w:p>
-      <w:r>
-        <w:rPr>
-          <w:noProof/>
-        </w:rPr>
-        <w:drawing>
-          <wp:inline distT="0" distB="0" distL="0" distR="0" wp14:anchorId="447D4911" wp14:editId="1C445E24">
-            <wp:extent cx="5724525" cy="2990850"/>
-            <wp:effectExtent l="0" t="0" r="0" b="0"/>
-            <wp:docPr id="1855897429" name="drawing"/>
-            <wp:cNvGraphicFramePr>
-              <a:graphicFrameLocks xmlns:a="http://schemas.openxmlformats.org/drawingml/2006/main" noChangeAspect="1"/>
-            </wp:cNvGraphicFramePr>
-            <a:graphic xmlns:a="http://schemas.openxmlformats.org/drawingml/2006/main">
-              <a:graphicData uri="http://schemas.openxmlformats.org/drawingml/2006/picture">
-                <pic:pic xmlns:pic="http://schemas.openxmlformats.org/drawingml/2006/picture">
-                  <pic:nvPicPr>
-                    <pic:cNvPr id="1764962878" name="Picture 1764962878"/>
-                    <pic:cNvPicPr/>
-                  </pic:nvPicPr>
-                  <pic:blipFill>
-                    <a:blip r:embed="rId5">
-                      <a:extLst>
-                        <a:ext uri="{28A0092B-C50C-407E-A947-70E740481C1C}">
-                          <a14:useLocalDpi xmlns:a14="http://schemas.microsoft.com/office/drawing/2010/main"/>
-                        </a:ext>
-                      </a:extLst>
-                    </a:blip>
-                    <a:stretch>
-                      <a:fillRect/>
-                    </a:stretch>
-                  </pic:blipFill>
-                  <pic:spPr>
-                    <a:xfrm>
-                      <a:off x="0" y="0"/>
-                      <a:ext cx="5724525" cy="2990850"/>
-                    </a:xfrm>
-                    <a:prstGeom prst="rect">
-                      <a:avLst/>
-                    </a:prstGeom>
-                  </pic:spPr>
-                </pic:pic>
-              </a:graphicData>
-            </a:graphic>
-          </wp:inline>
-        </w:drawing>
-      </w:r>
-    </w:p>
     <w:p/>
     <w:p/>
-    <w:p/>
-    <w:p/>
-    <w:p>
-      <w:r>
-        <w:rPr>
-          <w:noProof/>
-        </w:rPr>
-        <w:lastRenderedPageBreak/>
-        <w:drawing>
-          <wp:inline distT="0" distB="0" distL="0" distR="0" wp14:anchorId="5C040A30" wp14:editId="64073D58">
-            <wp:extent cx="6324600" cy="4714875"/>
-            <wp:effectExtent l="0" t="0" r="0" b="0"/>
-            <wp:docPr id="1172272115" name="drawing"/>
-            <wp:cNvGraphicFramePr>
-              <a:graphicFrameLocks xmlns:a="http://schemas.openxmlformats.org/drawingml/2006/main" noChangeAspect="1"/>
-            </wp:cNvGraphicFramePr>
-            <a:graphic xmlns:a="http://schemas.openxmlformats.org/drawingml/2006/main">
-              <a:graphicData uri="http://schemas.openxmlformats.org/drawingml/2006/picture">
-                <pic:pic xmlns:pic="http://schemas.openxmlformats.org/drawingml/2006/picture">
-                  <pic:nvPicPr>
-                    <pic:cNvPr id="1172272115" name="Picture 1172272115"/>
-                    <pic:cNvPicPr/>
-                  </pic:nvPicPr>
-                  <pic:blipFill>
-                    <a:blip r:embed="rId18">
-                      <a:extLst>
-                        <a:ext uri="{28A0092B-C50C-407E-A947-70E740481C1C}">
-                          <a14:useLocalDpi xmlns:a14="http://schemas.microsoft.com/office/drawing/2010/main"/>
-                        </a:ext>
-                      </a:extLst>
-                    </a:blip>
-                    <a:stretch>
-                      <a:fillRect/>
-                    </a:stretch>
-                  </pic:blipFill>
-                  <pic:spPr>
-                    <a:xfrm>
-                      <a:off x="0" y="0"/>
-                      <a:ext cx="6324600" cy="4714875"/>
-                    </a:xfrm>
-                    <a:prstGeom prst="rect">
-                      <a:avLst/>
-                    </a:prstGeom>
-                  </pic:spPr>
-                </pic:pic>
-              </a:graphicData>
-            </a:graphic>
-          </wp:inline>
-        </w:drawing>
-      </w:r>
-    </w:p>
+    <w:p w14:noSpellErr="1"/>
     <w:p>
       <w:pPr>
         <w:rPr>
@@ -1506,7 +1492,7 @@
       </w:pPr>
     </w:p>
     <w:sectPr>
-      <w:pgSz w:w="11906" w:h="16838"/>
+      <w:pgSz w:w="11906" w:h="16838" w:orient="portrait"/>
       <w:pgMar w:top="1440" w:right="1440" w:bottom="1440" w:left="1440" w:header="708" w:footer="708" w:gutter="0"/>
       <w:cols w:space="708"/>
       <w:docGrid w:linePitch="360"/>
@@ -1517,6 +1503,118 @@
 
 <file path=word/numbering.xml><?xml version="1.0" encoding="utf-8"?>
 <w:numbering xmlns:wpc="http://schemas.microsoft.com/office/word/2010/wordprocessingCanvas" xmlns:cx="http://schemas.microsoft.com/office/drawing/2014/chartex" xmlns:cx1="http://schemas.microsoft.com/office/drawing/2015/9/8/chartex" xmlns:cx2="http://schemas.microsoft.com/office/drawing/2015/10/21/chartex" xmlns:cx3="http://schemas.microsoft.com/office/drawing/2016/5/9/chartex" xmlns:cx4="http://schemas.microsoft.com/office/drawing/2016/5/10/chartex" xmlns:cx5="http://schemas.microsoft.com/office/drawing/2016/5/11/chartex" xmlns:cx6="http://schemas.microsoft.com/office/drawing/2016/5/12/chartex" xmlns:cx7="http://schemas.microsoft.com/office/drawing/2016/5/13/chartex" xmlns:cx8="http://schemas.microsoft.com/office/drawing/2016/5/14/chartex" xmlns:mc="http://schemas.openxmlformats.org/markup-compatibility/2006" xmlns:aink="http://schemas.microsoft.com/office/drawing/2016/ink" xmlns:am3d="http://schemas.microsoft.com/office/drawing/2017/model3d" xmlns:o="urn:schemas-microsoft-com:office:office" xmlns:oel="http://schemas.microsoft.com/office/2019/extlst" xmlns:r="http://schemas.openxmlformats.org/officeDocument/2006/relationships" xmlns:m="http://schemas.openxmlformats.org/officeDocument/2006/math" xmlns:v="urn:schemas-microsoft-com:vml" xmlns:wp14="http://schemas.microsoft.com/office/word/2010/wordprocessingDrawing" xmlns:wp="http://schemas.openxmlformats.org/drawingml/2006/wordprocessingDrawing" xmlns:w10="urn:schemas-microsoft-com:office:word" xmlns:w="http://schemas.openxmlformats.org/wordprocessingml/2006/main" xmlns:w14="http://schemas.microsoft.com/office/word/2010/wordml" xmlns:w15="http://schemas.microsoft.com/office/word/2012/wordml" xmlns:w16cex="http://schemas.microsoft.com/office/word/2018/wordml/cex" xmlns:w16cid="http://schemas.microsoft.com/office/word/2016/wordml/cid" xmlns:w16="http://schemas.microsoft.com/office/word/2018/wordml" xmlns:w16du="http://schemas.microsoft.com/office/word/2023/wordml/word16du" xmlns:w16sdtdh="http://schemas.microsoft.com/office/word/2020/wordml/sdtdatahash" xmlns:w16sdtfl="http://schemas.microsoft.com/office/word/2024/wordml/sdtformatlock" xmlns:w16se="http://schemas.microsoft.com/office/word/2015/wordml/symex" xmlns:wpg="http://schemas.microsoft.com/office/word/2010/wordprocessingGroup" xmlns:wpi="http://schemas.microsoft.com/office/word/2010/wordprocessingInk" xmlns:wne="http://schemas.microsoft.com/office/word/2006/wordml" xmlns:wps="http://schemas.microsoft.com/office/word/2010/wordprocessingShape" mc:Ignorable="w14 w15 w16se w16cid w16 w16cex w16sdtdh w16sdtfl w16du wp14">
+  <w:abstractNum xmlns:w="http://schemas.openxmlformats.org/wordprocessingml/2006/main" w:abstractNumId="4">
+    <w:nsid w:val="8efeced"/>
+    <w:multiLevelType xmlns:w="http://schemas.openxmlformats.org/wordprocessingml/2006/main" w:val="hybridMultilevel"/>
+    <w:lvl xmlns:w="http://schemas.openxmlformats.org/wordprocessingml/2006/main" w:ilvl="0">
+      <w:start w:val="1"/>
+      <w:numFmt w:val="bullet"/>
+      <w:lvlText w:val="-"/>
+      <w:lvlJc w:val="left"/>
+      <w:pPr>
+        <w:ind w:left="720" w:hanging="360"/>
+      </w:pPr>
+      <w:rPr>
+        <w:rFonts w:hint="default" w:ascii="Aptos" w:hAnsi="Aptos"/>
+      </w:rPr>
+    </w:lvl>
+    <w:lvl xmlns:w="http://schemas.openxmlformats.org/wordprocessingml/2006/main" w:ilvl="1">
+      <w:start w:val="1"/>
+      <w:numFmt w:val="bullet"/>
+      <w:lvlText w:val="o"/>
+      <w:lvlJc w:val="left"/>
+      <w:pPr>
+        <w:ind w:left="1440" w:hanging="360"/>
+      </w:pPr>
+      <w:rPr>
+        <w:rFonts w:hint="default" w:ascii="Courier New" w:hAnsi="Courier New"/>
+      </w:rPr>
+    </w:lvl>
+    <w:lvl xmlns:w="http://schemas.openxmlformats.org/wordprocessingml/2006/main" w:ilvl="2">
+      <w:start w:val="1"/>
+      <w:numFmt w:val="bullet"/>
+      <w:lvlText w:val=""/>
+      <w:lvlJc w:val="left"/>
+      <w:pPr>
+        <w:ind w:left="2160" w:hanging="360"/>
+      </w:pPr>
+      <w:rPr>
+        <w:rFonts w:hint="default" w:ascii="Wingdings" w:hAnsi="Wingdings"/>
+      </w:rPr>
+    </w:lvl>
+    <w:lvl xmlns:w="http://schemas.openxmlformats.org/wordprocessingml/2006/main" w:ilvl="3">
+      <w:start w:val="1"/>
+      <w:numFmt w:val="bullet"/>
+      <w:lvlText w:val=""/>
+      <w:lvlJc w:val="left"/>
+      <w:pPr>
+        <w:ind w:left="2880" w:hanging="360"/>
+      </w:pPr>
+      <w:rPr>
+        <w:rFonts w:hint="default" w:ascii="Symbol" w:hAnsi="Symbol"/>
+      </w:rPr>
+    </w:lvl>
+    <w:lvl xmlns:w="http://schemas.openxmlformats.org/wordprocessingml/2006/main" w:ilvl="4">
+      <w:start w:val="1"/>
+      <w:numFmt w:val="bullet"/>
+      <w:lvlText w:val="o"/>
+      <w:lvlJc w:val="left"/>
+      <w:pPr>
+        <w:ind w:left="3600" w:hanging="360"/>
+      </w:pPr>
+      <w:rPr>
+        <w:rFonts w:hint="default" w:ascii="Courier New" w:hAnsi="Courier New"/>
+      </w:rPr>
+    </w:lvl>
+    <w:lvl xmlns:w="http://schemas.openxmlformats.org/wordprocessingml/2006/main" w:ilvl="5">
+      <w:start w:val="1"/>
+      <w:numFmt w:val="bullet"/>
+      <w:lvlText w:val=""/>
+      <w:lvlJc w:val="left"/>
+      <w:pPr>
+        <w:ind w:left="4320" w:hanging="360"/>
+      </w:pPr>
+      <w:rPr>
+        <w:rFonts w:hint="default" w:ascii="Wingdings" w:hAnsi="Wingdings"/>
+      </w:rPr>
+    </w:lvl>
+    <w:lvl xmlns:w="http://schemas.openxmlformats.org/wordprocessingml/2006/main" w:ilvl="6">
+      <w:start w:val="1"/>
+      <w:numFmt w:val="bullet"/>
+      <w:lvlText w:val=""/>
+      <w:lvlJc w:val="left"/>
+      <w:pPr>
+        <w:ind w:left="5040" w:hanging="360"/>
+      </w:pPr>
+      <w:rPr>
+        <w:rFonts w:hint="default" w:ascii="Symbol" w:hAnsi="Symbol"/>
+      </w:rPr>
+    </w:lvl>
+    <w:lvl xmlns:w="http://schemas.openxmlformats.org/wordprocessingml/2006/main" w:ilvl="7">
+      <w:start w:val="1"/>
+      <w:numFmt w:val="bullet"/>
+      <w:lvlText w:val="o"/>
+      <w:lvlJc w:val="left"/>
+      <w:pPr>
+        <w:ind w:left="5760" w:hanging="360"/>
+      </w:pPr>
+      <w:rPr>
+        <w:rFonts w:hint="default" w:ascii="Courier New" w:hAnsi="Courier New"/>
+      </w:rPr>
+    </w:lvl>
+    <w:lvl xmlns:w="http://schemas.openxmlformats.org/wordprocessingml/2006/main" w:ilvl="8">
+      <w:start w:val="1"/>
+      <w:numFmt w:val="bullet"/>
+      <w:lvlText w:val=""/>
+      <w:lvlJc w:val="left"/>
+      <w:pPr>
+        <w:ind w:left="6480" w:hanging="360"/>
+      </w:pPr>
+      <w:rPr>
+        <w:rFonts w:hint="default" w:ascii="Wingdings" w:hAnsi="Wingdings"/>
+      </w:rPr>
+    </w:lvl>
+  </w:abstractNum>
   <w:abstractNum w:abstractNumId="0" w15:restartNumberingAfterBreak="0">
     <w:nsid w:val="00BDCD67"/>
     <w:multiLevelType w:val="hybridMultilevel"/>
@@ -1530,7 +1628,7 @@
         <w:ind w:left="720" w:hanging="360"/>
       </w:pPr>
       <w:rPr>
-        <w:rFonts w:ascii="Aptos" w:hAnsi="Aptos" w:hint="default"/>
+        <w:rFonts w:hint="default" w:ascii="Aptos" w:hAnsi="Aptos"/>
       </w:rPr>
     </w:lvl>
     <w:lvl w:ilvl="1" w:tplc="F5DA616A">
@@ -1542,7 +1640,7 @@
         <w:ind w:left="1440" w:hanging="360"/>
       </w:pPr>
       <w:rPr>
-        <w:rFonts w:ascii="Courier New" w:hAnsi="Courier New" w:hint="default"/>
+        <w:rFonts w:hint="default" w:ascii="Courier New" w:hAnsi="Courier New"/>
       </w:rPr>
     </w:lvl>
     <w:lvl w:ilvl="2" w:tplc="8AD0C68A">
@@ -1554,7 +1652,7 @@
         <w:ind w:left="2160" w:hanging="360"/>
       </w:pPr>
       <w:rPr>
-        <w:rFonts w:ascii="Wingdings" w:hAnsi="Wingdings" w:hint="default"/>
+        <w:rFonts w:hint="default" w:ascii="Wingdings" w:hAnsi="Wingdings"/>
       </w:rPr>
     </w:lvl>
     <w:lvl w:ilvl="3" w:tplc="251C1AC2">
@@ -1566,7 +1664,7 @@
         <w:ind w:left="2880" w:hanging="360"/>
       </w:pPr>
       <w:rPr>
-        <w:rFonts w:ascii="Symbol" w:hAnsi="Symbol" w:hint="default"/>
+        <w:rFonts w:hint="default" w:ascii="Symbol" w:hAnsi="Symbol"/>
       </w:rPr>
     </w:lvl>
     <w:lvl w:ilvl="4" w:tplc="E35618C2">
@@ -1578,7 +1676,7 @@
         <w:ind w:left="3600" w:hanging="360"/>
       </w:pPr>
       <w:rPr>
-        <w:rFonts w:ascii="Courier New" w:hAnsi="Courier New" w:hint="default"/>
+        <w:rFonts w:hint="default" w:ascii="Courier New" w:hAnsi="Courier New"/>
       </w:rPr>
     </w:lvl>
     <w:lvl w:ilvl="5" w:tplc="28FA4636">
@@ -1590,7 +1688,7 @@
         <w:ind w:left="4320" w:hanging="360"/>
       </w:pPr>
       <w:rPr>
-        <w:rFonts w:ascii="Wingdings" w:hAnsi="Wingdings" w:hint="default"/>
+        <w:rFonts w:hint="default" w:ascii="Wingdings" w:hAnsi="Wingdings"/>
       </w:rPr>
     </w:lvl>
     <w:lvl w:ilvl="6" w:tplc="10446D22">
@@ -1602,7 +1700,7 @@
         <w:ind w:left="5040" w:hanging="360"/>
       </w:pPr>
       <w:rPr>
-        <w:rFonts w:ascii="Symbol" w:hAnsi="Symbol" w:hint="default"/>
+        <w:rFonts w:hint="default" w:ascii="Symbol" w:hAnsi="Symbol"/>
       </w:rPr>
     </w:lvl>
     <w:lvl w:ilvl="7" w:tplc="5456E786">
@@ -1614,7 +1712,7 @@
         <w:ind w:left="5760" w:hanging="360"/>
       </w:pPr>
       <w:rPr>
-        <w:rFonts w:ascii="Courier New" w:hAnsi="Courier New" w:hint="default"/>
+        <w:rFonts w:hint="default" w:ascii="Courier New" w:hAnsi="Courier New"/>
       </w:rPr>
     </w:lvl>
     <w:lvl w:ilvl="8" w:tplc="9578B354">
@@ -1626,7 +1724,7 @@
         <w:ind w:left="6480" w:hanging="360"/>
       </w:pPr>
       <w:rPr>
-        <w:rFonts w:ascii="Wingdings" w:hAnsi="Wingdings" w:hint="default"/>
+        <w:rFonts w:hint="default" w:ascii="Wingdings" w:hAnsi="Wingdings"/>
       </w:rPr>
     </w:lvl>
   </w:abstractNum>
@@ -1643,7 +1741,7 @@
         <w:ind w:left="1068" w:hanging="360"/>
       </w:pPr>
       <w:rPr>
-        <w:rFonts w:ascii="Aptos" w:hAnsi="Aptos" w:hint="default"/>
+        <w:rFonts w:hint="default" w:ascii="Aptos" w:hAnsi="Aptos"/>
       </w:rPr>
     </w:lvl>
     <w:lvl w:ilvl="1" w:tplc="9A6233D0">
@@ -1655,7 +1753,7 @@
         <w:ind w:left="1788" w:hanging="360"/>
       </w:pPr>
       <w:rPr>
-        <w:rFonts w:ascii="Courier New" w:hAnsi="Courier New" w:hint="default"/>
+        <w:rFonts w:hint="default" w:ascii="Courier New" w:hAnsi="Courier New"/>
       </w:rPr>
     </w:lvl>
     <w:lvl w:ilvl="2" w:tplc="03D209D4">
@@ -1667,7 +1765,7 @@
         <w:ind w:left="2508" w:hanging="360"/>
       </w:pPr>
       <w:rPr>
-        <w:rFonts w:ascii="Wingdings" w:hAnsi="Wingdings" w:hint="default"/>
+        <w:rFonts w:hint="default" w:ascii="Wingdings" w:hAnsi="Wingdings"/>
       </w:rPr>
     </w:lvl>
     <w:lvl w:ilvl="3" w:tplc="8DDE152A">
@@ -1679,7 +1777,7 @@
         <w:ind w:left="3228" w:hanging="360"/>
       </w:pPr>
       <w:rPr>
-        <w:rFonts w:ascii="Symbol" w:hAnsi="Symbol" w:hint="default"/>
+        <w:rFonts w:hint="default" w:ascii="Symbol" w:hAnsi="Symbol"/>
       </w:rPr>
     </w:lvl>
     <w:lvl w:ilvl="4" w:tplc="54ACDB8E">
@@ -1691,7 +1789,7 @@
         <w:ind w:left="3948" w:hanging="360"/>
       </w:pPr>
       <w:rPr>
-        <w:rFonts w:ascii="Courier New" w:hAnsi="Courier New" w:hint="default"/>
+        <w:rFonts w:hint="default" w:ascii="Courier New" w:hAnsi="Courier New"/>
       </w:rPr>
     </w:lvl>
     <w:lvl w:ilvl="5" w:tplc="955C5DCE">
@@ -1703,7 +1801,7 @@
         <w:ind w:left="4668" w:hanging="360"/>
       </w:pPr>
       <w:rPr>
-        <w:rFonts w:ascii="Wingdings" w:hAnsi="Wingdings" w:hint="default"/>
+        <w:rFonts w:hint="default" w:ascii="Wingdings" w:hAnsi="Wingdings"/>
       </w:rPr>
     </w:lvl>
     <w:lvl w:ilvl="6" w:tplc="2E46976E">
@@ -1715,7 +1813,7 @@
         <w:ind w:left="5388" w:hanging="360"/>
       </w:pPr>
       <w:rPr>
-        <w:rFonts w:ascii="Symbol" w:hAnsi="Symbol" w:hint="default"/>
+        <w:rFonts w:hint="default" w:ascii="Symbol" w:hAnsi="Symbol"/>
       </w:rPr>
     </w:lvl>
     <w:lvl w:ilvl="7" w:tplc="F0709A8E">
@@ -1727,7 +1825,7 @@
         <w:ind w:left="6108" w:hanging="360"/>
       </w:pPr>
       <w:rPr>
-        <w:rFonts w:ascii="Courier New" w:hAnsi="Courier New" w:hint="default"/>
+        <w:rFonts w:hint="default" w:ascii="Courier New" w:hAnsi="Courier New"/>
       </w:rPr>
     </w:lvl>
     <w:lvl w:ilvl="8" w:tplc="DB5299EE">
@@ -1739,7 +1837,7 @@
         <w:ind w:left="6828" w:hanging="360"/>
       </w:pPr>
       <w:rPr>
-        <w:rFonts w:ascii="Wingdings" w:hAnsi="Wingdings" w:hint="default"/>
+        <w:rFonts w:hint="default" w:ascii="Wingdings" w:hAnsi="Wingdings"/>
       </w:rPr>
     </w:lvl>
   </w:abstractNum>
@@ -1756,7 +1854,7 @@
         <w:ind w:left="720" w:hanging="360"/>
       </w:pPr>
       <w:rPr>
-        <w:rFonts w:ascii="Aptos" w:hAnsi="Aptos" w:hint="default"/>
+        <w:rFonts w:hint="default" w:ascii="Aptos" w:hAnsi="Aptos"/>
       </w:rPr>
     </w:lvl>
     <w:lvl w:ilvl="1" w:tplc="F0966B44">
@@ -1768,7 +1866,7 @@
         <w:ind w:left="1440" w:hanging="360"/>
       </w:pPr>
       <w:rPr>
-        <w:rFonts w:ascii="Courier New" w:hAnsi="Courier New" w:hint="default"/>
+        <w:rFonts w:hint="default" w:ascii="Courier New" w:hAnsi="Courier New"/>
       </w:rPr>
     </w:lvl>
     <w:lvl w:ilvl="2" w:tplc="8D4ACFD8">
@@ -1780,7 +1878,7 @@
         <w:ind w:left="2160" w:hanging="360"/>
       </w:pPr>
       <w:rPr>
-        <w:rFonts w:ascii="Wingdings" w:hAnsi="Wingdings" w:hint="default"/>
+        <w:rFonts w:hint="default" w:ascii="Wingdings" w:hAnsi="Wingdings"/>
       </w:rPr>
     </w:lvl>
     <w:lvl w:ilvl="3" w:tplc="41DE3882">
@@ -1792,7 +1890,7 @@
         <w:ind w:left="2880" w:hanging="360"/>
       </w:pPr>
       <w:rPr>
-        <w:rFonts w:ascii="Symbol" w:hAnsi="Symbol" w:hint="default"/>
+        <w:rFonts w:hint="default" w:ascii="Symbol" w:hAnsi="Symbol"/>
       </w:rPr>
     </w:lvl>
     <w:lvl w:ilvl="4" w:tplc="27A677AC">
@@ -1804,7 +1902,7 @@
         <w:ind w:left="3600" w:hanging="360"/>
       </w:pPr>
       <w:rPr>
-        <w:rFonts w:ascii="Courier New" w:hAnsi="Courier New" w:hint="default"/>
+        <w:rFonts w:hint="default" w:ascii="Courier New" w:hAnsi="Courier New"/>
       </w:rPr>
     </w:lvl>
     <w:lvl w:ilvl="5" w:tplc="7548D49A">
@@ -1816,7 +1914,7 @@
         <w:ind w:left="4320" w:hanging="360"/>
       </w:pPr>
       <w:rPr>
-        <w:rFonts w:ascii="Wingdings" w:hAnsi="Wingdings" w:hint="default"/>
+        <w:rFonts w:hint="default" w:ascii="Wingdings" w:hAnsi="Wingdings"/>
       </w:rPr>
     </w:lvl>
     <w:lvl w:ilvl="6" w:tplc="B2001F1C">
@@ -1828,7 +1926,7 @@
         <w:ind w:left="5040" w:hanging="360"/>
       </w:pPr>
       <w:rPr>
-        <w:rFonts w:ascii="Symbol" w:hAnsi="Symbol" w:hint="default"/>
+        <w:rFonts w:hint="default" w:ascii="Symbol" w:hAnsi="Symbol"/>
       </w:rPr>
     </w:lvl>
     <w:lvl w:ilvl="7" w:tplc="C3285C0E">
@@ -1840,7 +1938,7 @@
         <w:ind w:left="5760" w:hanging="360"/>
       </w:pPr>
       <w:rPr>
-        <w:rFonts w:ascii="Courier New" w:hAnsi="Courier New" w:hint="default"/>
+        <w:rFonts w:hint="default" w:ascii="Courier New" w:hAnsi="Courier New"/>
       </w:rPr>
     </w:lvl>
     <w:lvl w:ilvl="8" w:tplc="EFCE7A56">
@@ -1852,7 +1950,7 @@
         <w:ind w:left="6480" w:hanging="360"/>
       </w:pPr>
       <w:rPr>
-        <w:rFonts w:ascii="Wingdings" w:hAnsi="Wingdings" w:hint="default"/>
+        <w:rFonts w:hint="default" w:ascii="Wingdings" w:hAnsi="Wingdings"/>
       </w:rPr>
     </w:lvl>
   </w:abstractNum>
@@ -1942,6 +2040,9 @@
       </w:pPr>
     </w:lvl>
   </w:abstractNum>
+  <w:num w:numId="5">
+    <w:abstractNumId w:val="4"/>
+  </w:num>
   <w:num w:numId="1" w16cid:durableId="288628588">
     <w:abstractNumId w:val="3"/>
   </w:num>
@@ -1958,11 +2059,11 @@
 </file>
 
 <file path=word/styles.xml><?xml version="1.0" encoding="utf-8"?>
-<w:styles xmlns:mc="http://schemas.openxmlformats.org/markup-compatibility/2006" xmlns:r="http://schemas.openxmlformats.org/officeDocument/2006/relationships" xmlns:w="http://schemas.openxmlformats.org/wordprocessingml/2006/main" xmlns:w14="http://schemas.microsoft.com/office/word/2010/wordml" xmlns:w15="http://schemas.microsoft.com/office/word/2012/wordml" xmlns:w16cex="http://schemas.microsoft.com/office/word/2018/wordml/cex" xmlns:w16cid="http://schemas.microsoft.com/office/word/2016/wordml/cid" xmlns:w16="http://schemas.microsoft.com/office/word/2018/wordml" xmlns:w16du="http://schemas.microsoft.com/office/word/2023/wordml/word16du" xmlns:w16sdtdh="http://schemas.microsoft.com/office/word/2020/wordml/sdtdatahash" xmlns:w16sdtfl="http://schemas.microsoft.com/office/word/2024/wordml/sdtformatlock" xmlns:w16se="http://schemas.microsoft.com/office/word/2015/wordml/symex" mc:Ignorable="w14 w15 w16se w16cid w16 w16cex w16sdtdh w16sdtfl w16du">
+<w:styles xmlns:wp14="http://schemas.microsoft.com/office/word/2010/wordprocessingDrawing" xmlns:mc="http://schemas.openxmlformats.org/markup-compatibility/2006" xmlns:r="http://schemas.openxmlformats.org/officeDocument/2006/relationships" xmlns:w="http://schemas.openxmlformats.org/wordprocessingml/2006/main" xmlns:w14="http://schemas.microsoft.com/office/word/2010/wordml" xmlns:w15="http://schemas.microsoft.com/office/word/2012/wordml" xmlns:w16cex="http://schemas.microsoft.com/office/word/2018/wordml/cex" xmlns:w16cid="http://schemas.microsoft.com/office/word/2016/wordml/cid" xmlns:w16="http://schemas.microsoft.com/office/word/2018/wordml" xmlns:w16du="http://schemas.microsoft.com/office/word/2023/wordml/word16du" xmlns:w16sdtdh="http://schemas.microsoft.com/office/word/2020/wordml/sdtdatahash" xmlns:w16sdtfl="http://schemas.microsoft.com/office/word/2024/wordml/sdtformatlock" xmlns:w16se="http://schemas.microsoft.com/office/word/2015/wordml/symex" mc:Ignorable="w14 w15 w16se w16cid w16 w16cex w16sdtdh w16sdtfl w16du wp14">
   <w:docDefaults>
     <w:rPrDefault>
       <w:rPr>
-        <w:rFonts w:asciiTheme="minorHAnsi" w:eastAsiaTheme="minorHAnsi" w:hAnsiTheme="minorHAnsi" w:cstheme="minorBidi"/>
+        <w:rFonts w:asciiTheme="minorHAnsi" w:hAnsiTheme="minorHAnsi" w:eastAsiaTheme="minorHAnsi" w:cstheme="minorBidi"/>
         <w:sz w:val="24"/>
         <w:szCs w:val="24"/>
         <w:lang w:val="hu-HU" w:eastAsia="en-US" w:bidi="ar-SA"/>
@@ -1977,14 +2078,14 @@
   <w:latentStyles w:defLockedState="0" w:defUIPriority="99" w:defSemiHidden="0" w:defUnhideWhenUsed="0" w:defQFormat="0" w:count="376">
     <w:lsdException w:name="Normal" w:uiPriority="0" w:qFormat="1"/>
     <w:lsdException w:name="heading 1" w:uiPriority="9" w:qFormat="1"/>
-    <w:lsdException w:name="heading 2" w:semiHidden="1" w:uiPriority="9" w:unhideWhenUsed="1" w:qFormat="1"/>
-    <w:lsdException w:name="heading 3" w:semiHidden="1" w:uiPriority="9" w:unhideWhenUsed="1" w:qFormat="1"/>
-    <w:lsdException w:name="heading 4" w:semiHidden="1" w:uiPriority="9" w:unhideWhenUsed="1" w:qFormat="1"/>
-    <w:lsdException w:name="heading 5" w:semiHidden="1" w:uiPriority="9" w:unhideWhenUsed="1" w:qFormat="1"/>
-    <w:lsdException w:name="heading 6" w:semiHidden="1" w:uiPriority="9" w:unhideWhenUsed="1" w:qFormat="1"/>
-    <w:lsdException w:name="heading 7" w:semiHidden="1" w:uiPriority="9" w:unhideWhenUsed="1" w:qFormat="1"/>
-    <w:lsdException w:name="heading 8" w:semiHidden="1" w:uiPriority="9" w:unhideWhenUsed="1" w:qFormat="1"/>
-    <w:lsdException w:name="heading 9" w:semiHidden="1" w:uiPriority="9" w:unhideWhenUsed="1" w:qFormat="1"/>
+    <w:lsdException w:name="heading 2" w:uiPriority="9" w:semiHidden="1" w:unhideWhenUsed="1" w:qFormat="1"/>
+    <w:lsdException w:name="heading 3" w:uiPriority="9" w:semiHidden="1" w:unhideWhenUsed="1" w:qFormat="1"/>
+    <w:lsdException w:name="heading 4" w:uiPriority="9" w:semiHidden="1" w:unhideWhenUsed="1" w:qFormat="1"/>
+    <w:lsdException w:name="heading 5" w:uiPriority="9" w:semiHidden="1" w:unhideWhenUsed="1" w:qFormat="1"/>
+    <w:lsdException w:name="heading 6" w:uiPriority="9" w:semiHidden="1" w:unhideWhenUsed="1" w:qFormat="1"/>
+    <w:lsdException w:name="heading 7" w:uiPriority="9" w:semiHidden="1" w:unhideWhenUsed="1" w:qFormat="1"/>
+    <w:lsdException w:name="heading 8" w:uiPriority="9" w:semiHidden="1" w:unhideWhenUsed="1" w:qFormat="1"/>
+    <w:lsdException w:name="heading 9" w:uiPriority="9" w:semiHidden="1" w:unhideWhenUsed="1" w:qFormat="1"/>
     <w:lsdException w:name="index 1" w:semiHidden="1" w:unhideWhenUsed="1"/>
     <w:lsdException w:name="index 2" w:semiHidden="1" w:unhideWhenUsed="1"/>
     <w:lsdException w:name="index 3" w:semiHidden="1" w:unhideWhenUsed="1"/>
@@ -1994,22 +2095,22 @@
     <w:lsdException w:name="index 7" w:semiHidden="1" w:unhideWhenUsed="1"/>
     <w:lsdException w:name="index 8" w:semiHidden="1" w:unhideWhenUsed="1"/>
     <w:lsdException w:name="index 9" w:semiHidden="1" w:unhideWhenUsed="1"/>
-    <w:lsdException w:name="toc 1" w:semiHidden="1" w:uiPriority="39" w:unhideWhenUsed="1"/>
-    <w:lsdException w:name="toc 2" w:semiHidden="1" w:uiPriority="39" w:unhideWhenUsed="1"/>
-    <w:lsdException w:name="toc 3" w:semiHidden="1" w:uiPriority="39" w:unhideWhenUsed="1"/>
-    <w:lsdException w:name="toc 4" w:semiHidden="1" w:uiPriority="39" w:unhideWhenUsed="1"/>
-    <w:lsdException w:name="toc 5" w:semiHidden="1" w:uiPriority="39" w:unhideWhenUsed="1"/>
-    <w:lsdException w:name="toc 6" w:semiHidden="1" w:uiPriority="39" w:unhideWhenUsed="1"/>
-    <w:lsdException w:name="toc 7" w:semiHidden="1" w:uiPriority="39" w:unhideWhenUsed="1"/>
-    <w:lsdException w:name="toc 8" w:semiHidden="1" w:uiPriority="39" w:unhideWhenUsed="1"/>
-    <w:lsdException w:name="toc 9" w:semiHidden="1" w:uiPriority="39" w:unhideWhenUsed="1"/>
+    <w:lsdException w:name="toc 1" w:uiPriority="39" w:semiHidden="1" w:unhideWhenUsed="1"/>
+    <w:lsdException w:name="toc 2" w:uiPriority="39" w:semiHidden="1" w:unhideWhenUsed="1"/>
+    <w:lsdException w:name="toc 3" w:uiPriority="39" w:semiHidden="1" w:unhideWhenUsed="1"/>
+    <w:lsdException w:name="toc 4" w:uiPriority="39" w:semiHidden="1" w:unhideWhenUsed="1"/>
+    <w:lsdException w:name="toc 5" w:uiPriority="39" w:semiHidden="1" w:unhideWhenUsed="1"/>
+    <w:lsdException w:name="toc 6" w:uiPriority="39" w:semiHidden="1" w:unhideWhenUsed="1"/>
+    <w:lsdException w:name="toc 7" w:uiPriority="39" w:semiHidden="1" w:unhideWhenUsed="1"/>
+    <w:lsdException w:name="toc 8" w:uiPriority="39" w:semiHidden="1" w:unhideWhenUsed="1"/>
+    <w:lsdException w:name="toc 9" w:uiPriority="39" w:semiHidden="1" w:unhideWhenUsed="1"/>
     <w:lsdException w:name="Normal Indent" w:semiHidden="1" w:unhideWhenUsed="1"/>
     <w:lsdException w:name="footnote text" w:semiHidden="1" w:unhideWhenUsed="1"/>
     <w:lsdException w:name="annotation text" w:semiHidden="1" w:unhideWhenUsed="1"/>
     <w:lsdException w:name="header" w:semiHidden="1" w:unhideWhenUsed="1"/>
     <w:lsdException w:name="footer" w:semiHidden="1" w:unhideWhenUsed="1"/>
     <w:lsdException w:name="index heading" w:semiHidden="1" w:unhideWhenUsed="1"/>
-    <w:lsdException w:name="caption" w:semiHidden="1" w:uiPriority="35" w:unhideWhenUsed="1" w:qFormat="1"/>
+    <w:lsdException w:name="caption" w:uiPriority="35" w:semiHidden="1" w:unhideWhenUsed="1" w:qFormat="1"/>
     <w:lsdException w:name="table of figures" w:semiHidden="1" w:unhideWhenUsed="1"/>
     <w:lsdException w:name="envelope address" w:semiHidden="1" w:unhideWhenUsed="1"/>
     <w:lsdException w:name="envelope return" w:semiHidden="1" w:unhideWhenUsed="1"/>
@@ -2040,7 +2141,7 @@
     <w:lsdException w:name="Title" w:uiPriority="10" w:qFormat="1"/>
     <w:lsdException w:name="Closing" w:semiHidden="1" w:unhideWhenUsed="1"/>
     <w:lsdException w:name="Signature" w:semiHidden="1" w:unhideWhenUsed="1"/>
-    <w:lsdException w:name="Default Paragraph Font" w:semiHidden="1" w:uiPriority="1" w:unhideWhenUsed="1"/>
+    <w:lsdException w:name="Default Paragraph Font" w:uiPriority="1" w:semiHidden="1" w:unhideWhenUsed="1"/>
     <w:lsdException w:name="Body Text" w:semiHidden="1" w:unhideWhenUsed="1"/>
     <w:lsdException w:name="Body Text Indent" w:semiHidden="1" w:unhideWhenUsed="1"/>
     <w:lsdException w:name="List Continue" w:semiHidden="1" w:unhideWhenUsed="1"/>
@@ -2240,8 +2341,8 @@
     <w:lsdException w:name="Subtle Reference" w:uiPriority="31" w:qFormat="1"/>
     <w:lsdException w:name="Intense Reference" w:uiPriority="32" w:qFormat="1"/>
     <w:lsdException w:name="Book Title" w:uiPriority="33" w:qFormat="1"/>
-    <w:lsdException w:name="Bibliography" w:semiHidden="1" w:uiPriority="37" w:unhideWhenUsed="1"/>
-    <w:lsdException w:name="TOC Heading" w:semiHidden="1" w:uiPriority="39" w:unhideWhenUsed="1" w:qFormat="1"/>
+    <w:lsdException w:name="Bibliography" w:uiPriority="37" w:semiHidden="1" w:unhideWhenUsed="1"/>
+    <w:lsdException w:name="TOC Heading" w:uiPriority="39" w:semiHidden="1" w:unhideWhenUsed="1" w:qFormat="1"/>
     <w:lsdException w:name="Plain Table 1" w:uiPriority="41"/>
     <w:lsdException w:name="Plain Table 2" w:uiPriority="42"/>
     <w:lsdException w:name="Plain Table 3" w:uiPriority="43"/>
@@ -2352,16 +2453,16 @@
     <w:lsdException w:name="Unresolved Mention" w:semiHidden="1" w:unhideWhenUsed="1"/>
     <w:lsdException w:name="Smart Link" w:semiHidden="1" w:unhideWhenUsed="1"/>
   </w:latentStyles>
-  <w:style w:type="paragraph" w:default="1" w:styleId="Norml">
+  <w:style w:type="paragraph" w:styleId="Norml" w:default="1">
     <w:name w:val="Normal"/>
     <w:qFormat/>
   </w:style>
-  <w:style w:type="character" w:default="1" w:styleId="Bekezdsalapbettpusa">
+  <w:style w:type="character" w:styleId="Bekezdsalapbettpusa" w:default="1">
     <w:name w:val="Default Paragraph Font"/>
     <w:uiPriority w:val="1"/>
     <w:unhideWhenUsed/>
   </w:style>
-  <w:style w:type="table" w:default="1" w:styleId="Normltblzat">
+  <w:style w:type="table" w:styleId="Normltblzat" w:default="1">
     <w:name w:val="Normal Table"/>
     <w:uiPriority w:val="99"/>
     <w:semiHidden/>
@@ -2376,7 +2477,7 @@
       </w:tblCellMar>
     </w:tblPr>
   </w:style>
-  <w:style w:type="numbering" w:default="1" w:styleId="Nemlista">
+  <w:style w:type="numbering" w:styleId="Nemlista" w:default="1">
     <w:name w:val="No List"/>
     <w:uiPriority w:val="99"/>
     <w:semiHidden/>
@@ -2408,7 +2509,7 @@
 </file>
 
 <file path=word/theme/theme1.xml><?xml version="1.0" encoding="utf-8"?>
-<a:theme xmlns:a="http://schemas.openxmlformats.org/drawingml/2006/main" name="Office Theme">
+<a:theme xmlns:a="http://schemas.openxmlformats.org/drawingml/2006/main" xmlns:thm15="http://schemas.microsoft.com/office/thememl/2012/main" name="Office Theme">
   <a:themeElements>
     <a:clrScheme name="Office">
       <a:dk1>

</xml_diff>